<commit_message>
Add Python, R programming, and statistical tools to software skills list
</commit_message>
<xml_diff>
--- a/CV ASHOKKUMAR KUMARAVEL.docx
+++ b/CV ASHOKKUMAR KUMARAVEL.docx
@@ -452,10 +452,6 @@
           <w:tab w:val="left" w:pos="5045"/>
         </w:tabs>
         <w:spacing w:before="18"/>
-        <w:rPr>
-          <w:rFonts w:ascii="Verdana" w:hAnsi="Verdana"/>
-          <w:sz w:val="20"/>
-        </w:rPr>
       </w:pPr>
       <w:r>
         <w:rPr>
@@ -557,23 +553,134 @@
     </w:p>
     <w:p>
       <w:pPr>
-        <w:pStyle w:val="BodyText"/>
-        <w:spacing w:before="11"/>
-        <w:rPr>
-          <w:rFonts w:ascii="Verdana" w:hAnsi="Verdana"/>
-          <w:sz w:val="12"/>
-        </w:rPr>
+        <w:tabs>
+          <w:tab w:val="left" w:pos="5045"/>
+        </w:tabs>
+        <w:spacing w:before="18"/>
       </w:pPr>
       <w:r>
         <w:rPr>
           <w:rFonts w:ascii="Verdana" w:hAnsi="Verdana"/>
+          <w:b/>
+          <w:bCs/>
+          <w:color w:val="4F81BD" w:themeColor="accent1"/>
+          <w:sz w:val="20"/>
+          <w:szCs w:val="20"/>
+        </w:rPr>
+        <w:t xml:space="preserve">                                                                 </w:t>
+      </w:r>
+      <w:r>
+        <w:rPr>
+          <w:rFonts w:ascii="Verdana" w:hAnsi="Verdana"/>
+          <w:b/>
+          <w:bCs/>
+          <w:color w:val="4F81BD" w:themeColor="accent1"/>
+          <w:sz w:val="20"/>
+          <w:szCs w:val="20"/>
+        </w:rPr>
+        <w:t>https://</w:t>
+      </w:r>
+      <w:hyperlink r:id="rId12" w:history="1">
+        <w:r>
+          <w:rPr>
+            <w:rStyle w:val="Hyperlink"/>
+            <w:rFonts w:ascii="Verdana" w:hAnsi="Verdana"/>
+            <w:b/>
+            <w:bCs/>
+            <w:sz w:val="20"/>
+            <w:szCs w:val="20"/>
+            <w:u w:val="none"/>
+          </w:rPr>
+          <w:t>Ashokkum</w:t>
+        </w:r>
+        <w:r>
+          <w:rPr>
+            <w:rStyle w:val="Hyperlink"/>
+            <w:rFonts w:ascii="Verdana" w:hAnsi="Verdana"/>
+            <w:b/>
+            <w:bCs/>
+            <w:sz w:val="20"/>
+            <w:szCs w:val="20"/>
+            <w:u w:val="none"/>
+          </w:rPr>
+          <w:t>a</w:t>
+        </w:r>
+        <w:r>
+          <w:rPr>
+            <w:rStyle w:val="Hyperlink"/>
+            <w:rFonts w:ascii="Verdana" w:hAnsi="Verdana"/>
+            <w:b/>
+            <w:bCs/>
+            <w:sz w:val="20"/>
+            <w:szCs w:val="20"/>
+            <w:u w:val="none"/>
+          </w:rPr>
+          <w:t>r</w:t>
+        </w:r>
+        <w:r>
+          <w:rPr>
+            <w:rStyle w:val="Hyperlink"/>
+            <w:rFonts w:ascii="Verdana" w:hAnsi="Verdana"/>
+            <w:b/>
+            <w:bCs/>
+            <w:sz w:val="20"/>
+            <w:szCs w:val="20"/>
+            <w:u w:val="none"/>
+          </w:rPr>
+          <w:t xml:space="preserve"> Kumar</w:t>
+        </w:r>
+        <w:r>
+          <w:rPr>
+            <w:rStyle w:val="Hyperlink"/>
+            <w:rFonts w:ascii="Verdana" w:hAnsi="Verdana"/>
+            <w:b/>
+            <w:bCs/>
+            <w:sz w:val="20"/>
+            <w:szCs w:val="20"/>
+            <w:u w:val="none"/>
+          </w:rPr>
+          <w:t>a</w:t>
+        </w:r>
+        <w:r>
+          <w:rPr>
+            <w:rStyle w:val="Hyperlink"/>
+            <w:rFonts w:ascii="Verdana" w:hAnsi="Verdana"/>
+            <w:b/>
+            <w:bCs/>
+            <w:sz w:val="20"/>
+            <w:szCs w:val="20"/>
+            <w:u w:val="none"/>
+          </w:rPr>
+          <w:t>vel.github.io/resume/</w:t>
+        </w:r>
+      </w:hyperlink>
+    </w:p>
+    <w:p>
+      <w:pPr>
+        <w:tabs>
+          <w:tab w:val="left" w:pos="5045"/>
+        </w:tabs>
+        <w:spacing w:before="18"/>
+        <w:jc w:val="center"/>
+        <w:rPr>
+          <w:rFonts w:ascii="Verdana" w:hAnsi="Verdana"/>
+          <w:b/>
+          <w:bCs/>
+        </w:rPr>
+      </w:pPr>
+      <w:r>
+        <w:rPr>
+          <w:rFonts w:ascii="Verdana" w:hAnsi="Verdana"/>
+          <w:b/>
+          <w:bCs/>
           <w:noProof/>
-          <w:sz w:val="12"/>
+          <w:sz w:val="14"/>
+          <w:szCs w:val="24"/>
         </w:rPr>
         <mc:AlternateContent>
           <mc:Choice Requires="wpg">
             <w:drawing>
-              <wp:anchor distT="0" distB="0" distL="0" distR="0" simplePos="0" relativeHeight="11" behindDoc="1" locked="0" layoutInCell="0" allowOverlap="1" wp14:anchorId="41A9171B" wp14:editId="0EE84D04">
+              <wp:anchor distT="0" distB="0" distL="0" distR="0" simplePos="0" relativeHeight="251659776" behindDoc="1" locked="0" layoutInCell="0" allowOverlap="1" wp14:anchorId="41A9171B" wp14:editId="0EE84D04">
                 <wp:simplePos x="0" y="0"/>
                 <wp:positionH relativeFrom="page">
                   <wp:posOffset>457200</wp:posOffset>
@@ -1008,7 +1115,7 @@
           </mc:Choice>
           <mc:Fallback>
             <w:pict>
-              <v:group w14:anchorId="0F412FD9" id="Group 2" o:spid="_x0000_s1026" style="position:absolute;margin-left:36pt;margin-top:9.05pt;width:558.15pt;height:1.6pt;z-index:-503316469;mso-wrap-distance-left:0;mso-wrap-distance-right:0;mso-position-horizontal-relative:page" coordsize="70884,201" o:gfxdata="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" o:allowincell="f">
+              <v:group w14:anchorId="563998A0" id="Group 2" o:spid="_x0000_s1026" style="position:absolute;margin-left:36pt;margin-top:9.05pt;width:558.15pt;height:1.6pt;z-index:-251656704;mso-wrap-distance-left:0;mso-wrap-distance-right:0;mso-position-horizontal-relative:page" coordsize="70884,201" o:gfxdata="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" o:allowincell="f">
                 <v:shape id="Graphic 3" o:spid="_x0000_s1027" style="position:absolute;width:70866;height:198;visibility:visible;mso-wrap-style:square;v-text-anchor:top" coordsize="7086600,19685" o:gfxdata="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" path="m7086600,l,,,266,,3302,,19685r7086600,l7086600,xe" fillcolor="#9f9f9f" stroked="f" strokeweight="0">
                   <v:path arrowok="t" textboxrect="0,0,7087235,20320"/>
                 </v:shape>
@@ -1033,17 +1140,15 @@
           </mc:Fallback>
         </mc:AlternateContent>
       </w:r>
-    </w:p>
-    <w:p>
-      <w:pPr>
-        <w:pStyle w:val="Heading2"/>
-        <w:spacing w:before="61"/>
-        <w:ind w:left="160"/>
-      </w:pPr>
-      <w:r>
-        <w:rPr>
+      <w:r>
+        <w:rPr>
+          <w:rFonts w:ascii="Verdana" w:hAnsi="Verdana"/>
+          <w:b/>
+          <w:bCs/>
           <w:color w:val="006FC0"/>
           <w:spacing w:val="-2"/>
+          <w:sz w:val="24"/>
+          <w:szCs w:val="24"/>
         </w:rPr>
         <w:t>SUMMARY</w:t>
       </w:r>
@@ -1627,7 +1732,7 @@
           </mc:Choice>
           <mc:Fallback>
             <w:pict>
-              <v:group w14:anchorId="57B3B3DC" id="Group 9" o:spid="_x0000_s1026" style="position:absolute;margin-left:36pt;margin-top:8.6pt;width:547.8pt;height:1.6pt;z-index:-503316468;mso-wrap-distance-left:0;mso-wrap-distance-right:0;mso-position-horizontal-relative:page" coordsize="69570,201" o:gfxdata="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" o:allowincell="f">
+              <v:group w14:anchorId="03138175" id="Group 9" o:spid="_x0000_s1026" style="position:absolute;margin-left:36pt;margin-top:8.6pt;width:547.8pt;height:1.6pt;z-index:-503316468;mso-wrap-distance-left:0;mso-wrap-distance-right:0;mso-position-horizontal-relative:page" coordsize="69570,201" o:gfxdata="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" o:allowincell="f">
                 <v:shape id="Graphic 10" o:spid="_x0000_s1027" style="position:absolute;width:69559;height:201;visibility:visible;mso-wrap-style:square;v-text-anchor:top" coordsize="6955790,19685" o:gfxdata="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" path="m6955790,l,,,127,,3175,,19685r6955790,l6955790,xe" fillcolor="#9f9f9f" stroked="f" strokeweight="0">
                   <v:path arrowok="t" textboxrect="0,0,6956425,20300"/>
                 </v:shape>
@@ -2783,7 +2888,7 @@
           </mc:Choice>
           <mc:Fallback>
             <w:pict>
-              <v:group w14:anchorId="50776184" id="Group 16" o:spid="_x0000_s1026" style="position:absolute;margin-left:38.4pt;margin-top:9.85pt;width:542.9pt;height:.75pt;z-index:-503316467;mso-wrap-distance-left:0;mso-wrap-distance-right:0;mso-position-horizontal-relative:page" coordsize="68947,93" o:gfxdata="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" o:allowincell="f">
+              <v:group w14:anchorId="30D3C449" id="Group 16" o:spid="_x0000_s1026" style="position:absolute;margin-left:38.4pt;margin-top:9.85pt;width:542.9pt;height:.75pt;z-index:-503316467;mso-wrap-distance-left:0;mso-wrap-distance-right:0;mso-position-horizontal-relative:page" coordsize="68947,93" o:gfxdata="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" o:allowincell="f">
                 <v:shape id="Graphic 17" o:spid="_x0000_s1027" style="position:absolute;width:68929;height:82;visibility:visible;mso-wrap-style:square;v-text-anchor:top" coordsize="6892925,8890" o:gfxdata="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" path="m6892925,l,,,368,,3416,,8877r6892925,l6892925,xe" fillcolor="#9f9f9f" stroked="f" strokeweight="0">
                   <v:path arrowok="t" textboxrect="0,0,6893560,9574"/>
                 </v:shape>
@@ -2881,7 +2986,6 @@
         <w:ind w:right="554" w:hanging="361"/>
         <w:rPr>
           <w:rFonts w:ascii="Wingdings" w:hAnsi="Wingdings"/>
-          <w:sz w:val="24"/>
         </w:rPr>
       </w:pPr>
       <w:r>
@@ -2889,7 +2993,6 @@
           <w:rFonts w:ascii="Verdana" w:hAnsi="Verdana"/>
           <w:b/>
           <w:spacing w:val="-4"/>
-          <w:sz w:val="24"/>
         </w:rPr>
         <w:t>Molecular</w:t>
       </w:r>
@@ -2898,7 +3001,6 @@
           <w:rFonts w:ascii="Verdana" w:hAnsi="Verdana"/>
           <w:b/>
           <w:spacing w:val="-17"/>
-          <w:sz w:val="24"/>
         </w:rPr>
         <w:t xml:space="preserve"> </w:t>
       </w:r>
@@ -2907,7 +3009,6 @@
           <w:rFonts w:ascii="Verdana" w:hAnsi="Verdana"/>
           <w:b/>
           <w:spacing w:val="-4"/>
-          <w:sz w:val="24"/>
         </w:rPr>
         <w:t>techniques</w:t>
       </w:r>
@@ -2915,7 +3016,6 @@
         <w:rPr>
           <w:rFonts w:ascii="Verdana" w:hAnsi="Verdana"/>
           <w:spacing w:val="-4"/>
-          <w:sz w:val="24"/>
         </w:rPr>
         <w:t>-</w:t>
       </w:r>
@@ -2923,274 +3023,205 @@
         <w:rPr>
           <w:rFonts w:ascii="Verdana" w:hAnsi="Verdana"/>
           <w:spacing w:val="-17"/>
-          <w:sz w:val="24"/>
         </w:rPr>
         <w:t xml:space="preserve"> </w:t>
       </w:r>
       <w:r>
         <w:rPr>
           <w:spacing w:val="-4"/>
-          <w:sz w:val="24"/>
         </w:rPr>
         <w:t>Molecular</w:t>
       </w:r>
       <w:r>
         <w:rPr>
           <w:spacing w:val="-11"/>
-          <w:sz w:val="24"/>
         </w:rPr>
         <w:t xml:space="preserve"> </w:t>
       </w:r>
       <w:r>
         <w:rPr>
           <w:spacing w:val="-4"/>
-          <w:sz w:val="24"/>
         </w:rPr>
         <w:t>cloning,</w:t>
       </w:r>
       <w:r>
         <w:rPr>
           <w:spacing w:val="-11"/>
-          <w:sz w:val="24"/>
         </w:rPr>
         <w:t xml:space="preserve"> </w:t>
       </w:r>
       <w:r>
         <w:rPr>
           <w:spacing w:val="-4"/>
-          <w:sz w:val="24"/>
         </w:rPr>
         <w:t>Gene</w:t>
       </w:r>
       <w:r>
         <w:rPr>
           <w:spacing w:val="-11"/>
-          <w:sz w:val="24"/>
         </w:rPr>
         <w:t xml:space="preserve"> </w:t>
       </w:r>
       <w:r>
         <w:rPr>
           <w:spacing w:val="-4"/>
-          <w:sz w:val="24"/>
         </w:rPr>
         <w:t>addition/Deletions/</w:t>
       </w:r>
       <w:r>
         <w:rPr>
           <w:spacing w:val="-11"/>
-          <w:sz w:val="24"/>
         </w:rPr>
         <w:t xml:space="preserve"> </w:t>
       </w:r>
       <w:r>
         <w:rPr>
           <w:spacing w:val="-4"/>
-          <w:sz w:val="24"/>
         </w:rPr>
         <w:t>mutations,</w:t>
       </w:r>
       <w:r>
         <w:rPr>
           <w:spacing w:val="-11"/>
-          <w:sz w:val="24"/>
         </w:rPr>
         <w:t xml:space="preserve"> </w:t>
       </w:r>
       <w:r>
         <w:rPr>
           <w:spacing w:val="-4"/>
-          <w:sz w:val="24"/>
         </w:rPr>
         <w:t>Metabolic</w:t>
       </w:r>
       <w:r>
         <w:rPr>
           <w:spacing w:val="-11"/>
-          <w:sz w:val="24"/>
         </w:rPr>
         <w:t xml:space="preserve"> </w:t>
       </w:r>
       <w:r>
         <w:rPr>
           <w:spacing w:val="-4"/>
-          <w:sz w:val="24"/>
         </w:rPr>
         <w:t xml:space="preserve">engineering </w:t>
       </w:r>
       <w:r>
-        <w:rPr>
-          <w:sz w:val="24"/>
-        </w:rPr>
         <w:t>through</w:t>
       </w:r>
       <w:r>
         <w:rPr>
           <w:spacing w:val="-15"/>
-          <w:sz w:val="24"/>
-        </w:rPr>
-        <w:t xml:space="preserve"> </w:t>
-      </w:r>
-      <w:r>
-        <w:rPr>
-          <w:sz w:val="24"/>
-        </w:rPr>
+        </w:rPr>
+        <w:t xml:space="preserve"> </w:t>
+      </w:r>
+      <w:r>
         <w:t>genetic</w:t>
       </w:r>
       <w:r>
         <w:rPr>
           <w:spacing w:val="-15"/>
-          <w:sz w:val="24"/>
-        </w:rPr>
-        <w:t xml:space="preserve"> </w:t>
-      </w:r>
-      <w:r>
-        <w:rPr>
-          <w:sz w:val="24"/>
-        </w:rPr>
+        </w:rPr>
+        <w:t xml:space="preserve"> </w:t>
+      </w:r>
+      <w:r>
         <w:t>engineering</w:t>
       </w:r>
       <w:r>
         <w:rPr>
           <w:spacing w:val="-13"/>
-          <w:sz w:val="24"/>
-        </w:rPr>
-        <w:t xml:space="preserve"> </w:t>
-      </w:r>
-      <w:r>
-        <w:rPr>
-          <w:sz w:val="24"/>
-        </w:rPr>
+        </w:rPr>
+        <w:t xml:space="preserve"> </w:t>
+      </w:r>
+      <w:r>
         <w:t>in</w:t>
       </w:r>
       <w:r>
         <w:rPr>
           <w:spacing w:val="-14"/>
-          <w:sz w:val="24"/>
-        </w:rPr>
-        <w:t xml:space="preserve"> </w:t>
-      </w:r>
-      <w:r>
-        <w:rPr>
-          <w:sz w:val="24"/>
-        </w:rPr>
+        </w:rPr>
+        <w:t xml:space="preserve"> </w:t>
+      </w:r>
+      <w:r>
         <w:t>microbes,</w:t>
       </w:r>
       <w:r>
         <w:rPr>
           <w:spacing w:val="-14"/>
-          <w:sz w:val="24"/>
-        </w:rPr>
-        <w:t xml:space="preserve"> </w:t>
-      </w:r>
-      <w:r>
-        <w:rPr>
-          <w:sz w:val="24"/>
-        </w:rPr>
+        </w:rPr>
+        <w:t xml:space="preserve"> </w:t>
+      </w:r>
+      <w:r>
         <w:t>microbial</w:t>
       </w:r>
       <w:r>
         <w:rPr>
           <w:spacing w:val="-11"/>
-          <w:sz w:val="24"/>
-        </w:rPr>
-        <w:t xml:space="preserve"> </w:t>
-      </w:r>
-      <w:r>
-        <w:rPr>
-          <w:sz w:val="24"/>
-        </w:rPr>
+        </w:rPr>
+        <w:t xml:space="preserve"> </w:t>
+      </w:r>
+      <w:r>
         <w:t>cell</w:t>
       </w:r>
       <w:r>
         <w:rPr>
           <w:spacing w:val="-13"/>
-          <w:sz w:val="24"/>
-        </w:rPr>
-        <w:t xml:space="preserve"> </w:t>
-      </w:r>
-      <w:r>
-        <w:rPr>
-          <w:sz w:val="24"/>
-        </w:rPr>
+        </w:rPr>
+        <w:t xml:space="preserve"> </w:t>
+      </w:r>
+      <w:r>
         <w:t>culture,</w:t>
       </w:r>
       <w:r>
         <w:rPr>
           <w:spacing w:val="-14"/>
-          <w:sz w:val="24"/>
-        </w:rPr>
-        <w:t xml:space="preserve"> </w:t>
-      </w:r>
-      <w:r>
-        <w:rPr>
-          <w:sz w:val="24"/>
-        </w:rPr>
+        </w:rPr>
+        <w:t xml:space="preserve"> </w:t>
+      </w:r>
+      <w:r>
         <w:t>primer</w:t>
       </w:r>
       <w:r>
         <w:rPr>
           <w:spacing w:val="-15"/>
-          <w:sz w:val="24"/>
-        </w:rPr>
-        <w:t xml:space="preserve"> </w:t>
-      </w:r>
-      <w:r>
-        <w:rPr>
-          <w:sz w:val="24"/>
-        </w:rPr>
+        </w:rPr>
+        <w:t xml:space="preserve"> </w:t>
+      </w:r>
+      <w:r>
         <w:t>designing,</w:t>
       </w:r>
       <w:r>
         <w:rPr>
           <w:spacing w:val="-13"/>
-          <w:sz w:val="24"/>
-        </w:rPr>
-        <w:t xml:space="preserve"> </w:t>
-      </w:r>
-      <w:r>
-        <w:rPr>
-          <w:sz w:val="24"/>
-        </w:rPr>
+        </w:rPr>
+        <w:t xml:space="preserve"> </w:t>
+      </w:r>
+      <w:r>
         <w:t>PCR,</w:t>
       </w:r>
       <w:r>
         <w:rPr>
           <w:spacing w:val="-15"/>
-          <w:sz w:val="24"/>
-        </w:rPr>
-        <w:t xml:space="preserve"> </w:t>
-      </w:r>
-      <w:r>
-        <w:rPr>
-          <w:sz w:val="24"/>
-        </w:rPr>
+        </w:rPr>
+        <w:t xml:space="preserve"> </w:t>
+      </w:r>
+      <w:r>
         <w:t>qPCR,</w:t>
       </w:r>
       <w:r>
         <w:rPr>
           <w:spacing w:val="-11"/>
-          <w:sz w:val="24"/>
-        </w:rPr>
-        <w:t xml:space="preserve"> </w:t>
-      </w:r>
-      <w:r>
-        <w:rPr>
-          <w:sz w:val="24"/>
-        </w:rPr>
+        </w:rPr>
+        <w:t xml:space="preserve"> </w:t>
+      </w:r>
+      <w:r>
         <w:t>AGE,</w:t>
       </w:r>
       <w:r>
         <w:rPr>
           <w:spacing w:val="-15"/>
-          <w:sz w:val="24"/>
-        </w:rPr>
-        <w:t xml:space="preserve"> </w:t>
-      </w:r>
-      <w:r>
-        <w:rPr>
-          <w:sz w:val="24"/>
-        </w:rPr>
+        </w:rPr>
+        <w:t xml:space="preserve"> </w:t>
+      </w:r>
+      <w:r>
         <w:t>SDS-PAGE and proficient in operating bioreactors.</w:t>
       </w:r>
     </w:p>
@@ -3209,7 +3240,6 @@
         <w:ind w:right="554" w:hanging="361"/>
         <w:rPr>
           <w:rFonts w:ascii="Wingdings" w:hAnsi="Wingdings"/>
-          <w:sz w:val="24"/>
         </w:rPr>
       </w:pPr>
       <w:r>
@@ -3217,7 +3247,6 @@
           <w:rFonts w:ascii="Verdana" w:hAnsi="Verdana"/>
           <w:b/>
           <w:spacing w:val="-4"/>
-          <w:sz w:val="24"/>
         </w:rPr>
         <w:t xml:space="preserve">Material Synthesis – </w:t>
       </w:r>
@@ -3225,70 +3254,12 @@
         <w:rPr>
           <w:bCs/>
           <w:spacing w:val="-4"/>
-          <w:szCs w:val="20"/>
-        </w:rPr>
-        <w:t>Green</w:t>
-      </w:r>
-      <w:r>
-        <w:rPr>
-          <w:bCs/>
-          <w:spacing w:val="-4"/>
-          <w:szCs w:val="20"/>
-        </w:rPr>
-        <w:t xml:space="preserve">, </w:t>
-      </w:r>
-      <w:r>
-        <w:rPr>
-          <w:bCs/>
-          <w:spacing w:val="-4"/>
-          <w:szCs w:val="20"/>
-        </w:rPr>
-        <w:t>Chemical</w:t>
-      </w:r>
-      <w:r>
-        <w:rPr>
-          <w:bCs/>
-          <w:spacing w:val="-4"/>
-          <w:szCs w:val="20"/>
-        </w:rPr>
-        <w:t xml:space="preserve"> and Microbial</w:t>
-      </w:r>
-      <w:r>
-        <w:rPr>
-          <w:bCs/>
-          <w:spacing w:val="-4"/>
-          <w:szCs w:val="20"/>
-        </w:rPr>
-        <w:t xml:space="preserve"> Synthesis of </w:t>
-      </w:r>
-      <w:r>
-        <w:rPr>
-          <w:bCs/>
-          <w:spacing w:val="-4"/>
-          <w:szCs w:val="20"/>
-        </w:rPr>
-        <w:t>N</w:t>
-      </w:r>
-      <w:r>
-        <w:rPr>
-          <w:bCs/>
-          <w:spacing w:val="-4"/>
-          <w:szCs w:val="20"/>
-        </w:rPr>
-        <w:t>anoparticle</w:t>
-      </w:r>
-      <w:r>
-        <w:rPr>
-          <w:bCs/>
-          <w:spacing w:val="-4"/>
-          <w:szCs w:val="20"/>
-        </w:rPr>
-        <w:t>.</w:t>
+        </w:rPr>
+        <w:t>Green, Chemical and Microbial Synthesis of Nanoparticle.</w:t>
       </w:r>
       <w:r>
         <w:rPr>
           <w:rFonts w:ascii="Wingdings" w:hAnsi="Wingdings"/>
-          <w:sz w:val="24"/>
         </w:rPr>
         <w:t xml:space="preserve"> </w:t>
       </w:r>
@@ -3308,7 +3279,6 @@
         <w:ind w:right="558" w:hanging="361"/>
         <w:rPr>
           <w:rFonts w:ascii="Wingdings" w:hAnsi="Wingdings"/>
-          <w:sz w:val="24"/>
         </w:rPr>
       </w:pPr>
       <w:r>
@@ -3316,14 +3286,12 @@
           <w:rFonts w:ascii="Verdana" w:hAnsi="Verdana"/>
           <w:b/>
           <w:w w:val="90"/>
-          <w:sz w:val="24"/>
         </w:rPr>
         <w:t xml:space="preserve">Spectroscopic and analytical techniques </w:t>
       </w:r>
       <w:r>
         <w:rPr>
           <w:w w:val="90"/>
-          <w:sz w:val="24"/>
         </w:rPr>
         <w:t>- ICP-OES (</w:t>
       </w:r>
@@ -3331,21 +3299,16 @@
         <w:rPr>
           <w:color w:val="1F1F22"/>
           <w:w w:val="90"/>
-          <w:sz w:val="24"/>
         </w:rPr>
         <w:t xml:space="preserve">Inductively coupled plasma-optical emission </w:t>
       </w:r>
       <w:r>
         <w:rPr>
           <w:color w:val="1F1F22"/>
-          <w:sz w:val="24"/>
         </w:rPr>
         <w:t>spectrometry</w:t>
       </w:r>
       <w:r>
-        <w:rPr>
-          <w:sz w:val="24"/>
-        </w:rPr>
         <w:t>), XRD, FTIR, Raman spectroscopy, XPS, TEM, SEM, Zeta Analyzer, HPLC, GC-MS.</w:t>
       </w:r>
     </w:p>
@@ -3365,7 +3328,6 @@
         <w:jc w:val="left"/>
         <w:rPr>
           <w:rFonts w:ascii="Wingdings" w:hAnsi="Wingdings"/>
-          <w:sz w:val="24"/>
         </w:rPr>
       </w:pPr>
       <w:r>
@@ -3373,7 +3335,6 @@
           <w:rFonts w:ascii="Verdana" w:hAnsi="Verdana"/>
           <w:b/>
           <w:spacing w:val="-2"/>
-          <w:sz w:val="24"/>
         </w:rPr>
         <w:t>Software</w:t>
       </w:r>
@@ -3382,7 +3343,6 @@
           <w:rFonts w:ascii="Verdana" w:hAnsi="Verdana"/>
           <w:b/>
           <w:spacing w:val="-7"/>
-          <w:sz w:val="24"/>
         </w:rPr>
         <w:t xml:space="preserve"> </w:t>
       </w:r>
@@ -3391,7 +3351,6 @@
           <w:rFonts w:ascii="Verdana" w:hAnsi="Verdana"/>
           <w:b/>
           <w:spacing w:val="-2"/>
-          <w:sz w:val="24"/>
         </w:rPr>
         <w:t>packages</w:t>
       </w:r>
@@ -3400,7 +3359,6 @@
           <w:rFonts w:ascii="Verdana" w:hAnsi="Verdana"/>
           <w:b/>
           <w:spacing w:val="-5"/>
-          <w:sz w:val="24"/>
         </w:rPr>
         <w:t xml:space="preserve"> </w:t>
       </w:r>
@@ -3408,153 +3366,134 @@
         <w:rPr>
           <w:rFonts w:ascii="Verdana" w:hAnsi="Verdana"/>
           <w:spacing w:val="-2"/>
-          <w:sz w:val="24"/>
-        </w:rPr>
-        <w:t>-</w:t>
+        </w:rPr>
+        <w:t>–</w:t>
       </w:r>
       <w:r>
         <w:rPr>
           <w:rFonts w:ascii="Verdana" w:hAnsi="Verdana"/>
           <w:spacing w:val="-15"/>
-          <w:sz w:val="24"/>
-        </w:rPr>
-        <w:t xml:space="preserve"> </w:t>
+        </w:rPr>
+        <w:t xml:space="preserve"> </w:t>
+      </w:r>
+      <w:r>
+        <w:rPr>
+          <w:spacing w:val="-15"/>
+        </w:rPr>
+        <w:t>Python, R programming</w:t>
+      </w:r>
+      <w:r>
+        <w:rPr>
+          <w:rFonts w:ascii="Verdana" w:hAnsi="Verdana"/>
+          <w:spacing w:val="-15"/>
+        </w:rPr>
+        <w:t xml:space="preserve">, </w:t>
       </w:r>
       <w:r>
         <w:rPr>
           <w:spacing w:val="-2"/>
-          <w:sz w:val="24"/>
         </w:rPr>
         <w:t>Molecular</w:t>
       </w:r>
       <w:r>
-        <w:rPr>
-          <w:sz w:val="24"/>
-        </w:rPr>
         <w:t xml:space="preserve"> </w:t>
       </w:r>
       <w:r>
         <w:rPr>
           <w:spacing w:val="-2"/>
-          <w:sz w:val="24"/>
         </w:rPr>
         <w:t>Docking,</w:t>
       </w:r>
       <w:r>
         <w:rPr>
           <w:spacing w:val="12"/>
-          <w:sz w:val="24"/>
         </w:rPr>
         <w:t xml:space="preserve"> </w:t>
       </w:r>
       <w:r>
         <w:rPr>
           <w:spacing w:val="-2"/>
-          <w:sz w:val="24"/>
         </w:rPr>
         <w:t>Online</w:t>
       </w:r>
       <w:r>
         <w:rPr>
           <w:spacing w:val="10"/>
-          <w:sz w:val="24"/>
         </w:rPr>
         <w:t xml:space="preserve"> </w:t>
       </w:r>
       <w:r>
         <w:rPr>
           <w:spacing w:val="-2"/>
-          <w:sz w:val="24"/>
         </w:rPr>
         <w:t>Bioinformatic</w:t>
       </w:r>
       <w:r>
         <w:rPr>
           <w:spacing w:val="10"/>
-          <w:sz w:val="24"/>
         </w:rPr>
         <w:t xml:space="preserve"> </w:t>
       </w:r>
       <w:r>
         <w:rPr>
           <w:spacing w:val="-2"/>
-          <w:sz w:val="24"/>
         </w:rPr>
         <w:t>tools,</w:t>
       </w:r>
       <w:r>
-        <w:rPr>
-          <w:sz w:val="24"/>
-        </w:rPr>
         <w:t xml:space="preserve"> </w:t>
       </w:r>
       <w:r>
         <w:rPr>
           <w:spacing w:val="-2"/>
-          <w:sz w:val="24"/>
         </w:rPr>
         <w:t>Origin,</w:t>
       </w:r>
       <w:r>
         <w:rPr>
           <w:spacing w:val="12"/>
-          <w:sz w:val="24"/>
         </w:rPr>
         <w:t xml:space="preserve"> </w:t>
       </w:r>
       <w:r>
         <w:rPr>
           <w:spacing w:val="-2"/>
-          <w:sz w:val="24"/>
         </w:rPr>
         <w:t>Image</w:t>
       </w:r>
       <w:r>
         <w:rPr>
           <w:spacing w:val="9"/>
-          <w:sz w:val="24"/>
         </w:rPr>
         <w:t xml:space="preserve"> </w:t>
       </w:r>
       <w:r>
         <w:rPr>
           <w:spacing w:val="-2"/>
-          <w:sz w:val="24"/>
         </w:rPr>
         <w:t>and</w:t>
       </w:r>
       <w:r>
         <w:rPr>
           <w:spacing w:val="10"/>
-          <w:sz w:val="24"/>
         </w:rPr>
         <w:t xml:space="preserve"> </w:t>
       </w:r>
       <w:r>
         <w:rPr>
           <w:spacing w:val="-2"/>
-          <w:sz w:val="24"/>
         </w:rPr>
         <w:t xml:space="preserve">Diameter </w:t>
       </w:r>
       <w:r>
-        <w:rPr>
-          <w:sz w:val="24"/>
-        </w:rPr>
         <w:t xml:space="preserve">J, </w:t>
       </w:r>
       <w:proofErr w:type="spellStart"/>
       <w:r>
-        <w:rPr>
-          <w:sz w:val="24"/>
-        </w:rPr>
         <w:t>X'Pert</w:t>
       </w:r>
       <w:proofErr w:type="spellEnd"/>
       <w:r>
-        <w:rPr>
-          <w:sz w:val="24"/>
-        </w:rPr>
         <w:t xml:space="preserve"> high score plus, Microsoft Office.</w:t>
       </w:r>
     </w:p>
@@ -4009,7 +3948,7 @@
           </mc:Choice>
           <mc:Fallback>
             <w:pict>
-              <v:group w14:anchorId="5F19DB7E" id="Group 23" o:spid="_x0000_s1026" style="position:absolute;margin-left:36pt;margin-top:8pt;width:547.8pt;height:1.65pt;z-index:-503316466;mso-wrap-distance-left:0;mso-wrap-distance-right:0;mso-wrap-distance-bottom:.05pt;mso-position-horizontal-relative:page" coordsize="69570,208" o:gfxdata="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" o:allowincell="f">
+              <v:group w14:anchorId="5519770E" id="Group 23" o:spid="_x0000_s1026" style="position:absolute;margin-left:36pt;margin-top:8pt;width:547.8pt;height:1.65pt;z-index:-503316466;mso-wrap-distance-left:0;mso-wrap-distance-right:0;mso-wrap-distance-bottom:.05pt;mso-position-horizontal-relative:page" coordsize="69570,208" o:gfxdata="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" o:allowincell="f">
                 <v:shape id="Graphic 24" o:spid="_x0000_s1027" style="position:absolute;width:69559;height:198;visibility:visible;mso-wrap-style:square;v-text-anchor:top" coordsize="6955790,19685" o:gfxdata="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" path="m6955790,l,,,901,,3937,,19685r6955790,l6955790,xe" fillcolor="#9f9f9f" stroked="f" strokeweight="0">
                   <v:path arrowok="t" textboxrect="0,0,6956425,20320"/>
                 </v:shape>
@@ -4848,7 +4787,7 @@
           </mc:Choice>
           <mc:Fallback>
             <w:pict>
-              <v:group w14:anchorId="63DE8B8E" id="Group 30" o:spid="_x0000_s1026" style="position:absolute;margin-left:36pt;margin-top:9.7pt;width:558.15pt;height:1.65pt;z-index:-503316465;mso-wrap-distance-left:0;mso-wrap-distance-right:0;mso-position-horizontal-relative:page" coordsize="70884,208" o:gfxdata="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" o:allowincell="f">
+              <v:group w14:anchorId="0060A032" id="Group 30" o:spid="_x0000_s1026" style="position:absolute;margin-left:36pt;margin-top:9.7pt;width:558.15pt;height:1.65pt;z-index:-503316465;mso-wrap-distance-left:0;mso-wrap-distance-right:0;mso-position-horizontal-relative:page" coordsize="70884,208" o:gfxdata="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" o:allowincell="f">
                 <v:shape id="Graphic 31" o:spid="_x0000_s1027" style="position:absolute;width:70866;height:198;visibility:visible;mso-wrap-style:square;v-text-anchor:top" coordsize="7086600,19685" o:gfxdata="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" path="m7086600,l,,,901,,3949,,19685r7086600,l7086600,xe" fillcolor="#9f9f9f" stroked="f" strokeweight="0">
                   <v:path arrowok="t" textboxrect="0,0,7087235,20320"/>
                 </v:shape>
@@ -5816,7 +5755,7 @@
           </mc:Choice>
           <mc:Fallback>
             <w:pict>
-              <v:group w14:anchorId="7F5865A1" id="Group 37" o:spid="_x0000_s1026" style="position:absolute;margin-left:36pt;margin-top:8.45pt;width:558.15pt;height:1.7pt;z-index:-503316464;mso-wrap-distance-left:0;mso-wrap-distance-right:0;mso-position-horizontal-relative:page" coordsize="70884,216" o:gfxdata="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" o:allowincell="f">
+              <v:group w14:anchorId="33FF2991" id="Group 37" o:spid="_x0000_s1026" style="position:absolute;margin-left:36pt;margin-top:8.45pt;width:558.15pt;height:1.7pt;z-index:-503316464;mso-wrap-distance-left:0;mso-wrap-distance-right:0;mso-position-horizontal-relative:page" coordsize="70884,216" o:gfxdata="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" o:allowincell="f">
                 <v:shape id="Graphic 38" o:spid="_x0000_s1027" style="position:absolute;width:70866;height:201;visibility:visible;mso-wrap-style:square;v-text-anchor:top" coordsize="7086600,20320" o:gfxdata="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" path="m7086600,l,,,1536,,4572,,20320r7086600,l7086600,xe" fillcolor="#9f9f9f" stroked="f" strokeweight="0">
                   <v:path arrowok="t" textboxrect="0,0,7087235,20955"/>
                 </v:shape>
@@ -6682,7 +6621,7 @@
           </mc:Choice>
           <mc:Fallback>
             <w:pict>
-              <v:group w14:anchorId="3681132D" id="Group 44" o:spid="_x0000_s1026" style="position:absolute;margin-left:36pt;margin-top:9.7pt;width:558.15pt;height:1.65pt;z-index:-503316463;mso-wrap-distance-left:0;mso-wrap-distance-right:0;mso-position-horizontal-relative:page" coordsize="70884,208" o:gfxdata="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" o:allowincell="f">
+              <v:group w14:anchorId="4D11D228" id="Group 44" o:spid="_x0000_s1026" style="position:absolute;margin-left:36pt;margin-top:9.7pt;width:558.15pt;height:1.65pt;z-index:-503316463;mso-wrap-distance-left:0;mso-wrap-distance-right:0;mso-position-horizontal-relative:page" coordsize="70884,208" o:gfxdata="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" o:allowincell="f">
                 <v:shape id="Graphic 45" o:spid="_x0000_s1027" style="position:absolute;width:70866;height:198;visibility:visible;mso-wrap-style:square;v-text-anchor:top" coordsize="7086600,19685" o:gfxdata="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" path="m7086600,l,,,1155,,4191,,19685r7086600,l7086600,xe" fillcolor="#9f9f9f" stroked="f" strokeweight="0">
                   <v:path arrowok="t" textboxrect="0,0,7087235,20320"/>
                 </v:shape>
@@ -7541,7 +7480,7 @@
           </mc:Choice>
           <mc:Fallback>
             <w:pict>
-              <v:group w14:anchorId="48B3989E" id="Group 51" o:spid="_x0000_s1026" style="position:absolute;margin-left:36pt;margin-top:9.55pt;width:558.15pt;height:1.7pt;z-index:-503316453;mso-wrap-distance-left:0;mso-wrap-distance-right:0;mso-position-horizontal-relative:page" coordsize="70884,216" o:gfxdata="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" o:allowincell="f">
+              <v:group w14:anchorId="6EE3B3D1" id="Group 51" o:spid="_x0000_s1026" style="position:absolute;margin-left:36pt;margin-top:9.55pt;width:558.15pt;height:1.7pt;z-index:-503316453;mso-wrap-distance-left:0;mso-wrap-distance-right:0;mso-position-horizontal-relative:page" coordsize="70884,216" o:gfxdata="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" o:allowincell="f">
                 <v:shape id="Graphic 52" o:spid="_x0000_s1027" style="position:absolute;width:70866;height:201;visibility:visible;mso-wrap-style:square;v-text-anchor:top" coordsize="7086600,20320" o:gfxdata="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" path="m7086600,l,,,1790,,4826,,20320r7086600,l7086600,xe" fillcolor="#9f9f9f" stroked="f" strokeweight="0">
                   <v:path arrowok="t" textboxrect="0,0,7087235,20955"/>
                 </v:shape>
@@ -7570,9 +7509,9 @@
     <w:p>
       <w:pPr>
         <w:sectPr>
-          <w:headerReference w:type="even" r:id="rId12"/>
-          <w:headerReference w:type="default" r:id="rId13"/>
-          <w:headerReference w:type="first" r:id="rId14"/>
+          <w:headerReference w:type="even" r:id="rId13"/>
+          <w:headerReference w:type="default" r:id="rId14"/>
+          <w:headerReference w:type="first" r:id="rId15"/>
           <w:pgSz w:w="12240" w:h="15840"/>
           <w:pgMar w:top="920" w:right="0" w:bottom="0" w:left="720" w:header="727" w:footer="0" w:gutter="0"/>
           <w:cols w:space="720"/>
@@ -8030,7 +7969,7 @@
           </mc:Choice>
           <mc:Fallback>
             <w:pict>
-              <v:group w14:anchorId="1A990BA2" id="Group 58" o:spid="_x0000_s1026" style="width:558.15pt;height:1.6pt;mso-position-horizontal-relative:char;mso-position-vertical-relative:line" coordsize="70884,201" o:gfxdata="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">
+              <v:group w14:anchorId="335E2783" id="Group 58" o:spid="_x0000_s1026" style="width:558.15pt;height:1.6pt;mso-position-horizontal-relative:char;mso-position-vertical-relative:line" coordsize="70884,201" o:gfxdata="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">
                 <v:shape id="Graphic 59" o:spid="_x0000_s1027" style="position:absolute;width:70866;height:198;visibility:visible;mso-wrap-style:square;v-text-anchor:top" coordsize="7086600,19685" o:gfxdata="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" path="m7086600,l,,,127,,3175,,19685r7086600,l7086600,xe" fillcolor="#9f9f9f" stroked="f" strokeweight="0">
                   <v:path arrowok="t" textboxrect="0,0,7087235,20320"/>
                 </v:shape>
@@ -9042,7 +8981,7 @@
           </mc:Choice>
           <mc:Fallback>
             <w:pict>
-              <v:group w14:anchorId="625B1F9C" id="Group 65" o:spid="_x0000_s1026" style="position:absolute;margin-left:36pt;margin-top:8.2pt;width:545.3pt;height:1.6pt;z-index:-503316454;mso-wrap-distance-left:0;mso-wrap-distance-right:0;mso-position-horizontal-relative:page" coordsize="69253,201" o:gfxdata="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" o:allowincell="f">
+              <v:group w14:anchorId="6DD53645" id="Group 65" o:spid="_x0000_s1026" style="position:absolute;margin-left:36pt;margin-top:8.2pt;width:545.3pt;height:1.6pt;z-index:-503316454;mso-wrap-distance-left:0;mso-wrap-distance-right:0;mso-position-horizontal-relative:page" coordsize="69253,201" o:gfxdata="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" o:allowincell="f">
                 <v:shape id="Graphic 66" o:spid="_x0000_s1027" style="position:absolute;width:69235;height:198;visibility:visible;mso-wrap-style:square;v-text-anchor:top" coordsize="6923405,19685" o:gfxdata="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" path="m6923405,l,,,381,,3429,,19685r6923405,l6923405,xe" fillcolor="#9f9f9f" stroked="f" strokeweight="0">
                   <v:path arrowok="t" textboxrect="0,0,6924040,20320"/>
                 </v:shape>
@@ -10274,7 +10213,7 @@
           </mc:Choice>
           <mc:Fallback>
             <w:pict>
-              <v:group w14:anchorId="788DD53D" id="Group 72" o:spid="_x0000_s1026" style="position:absolute;margin-left:36pt;margin-top:8.65pt;width:547.95pt;height:1.6pt;z-index:-503316455;mso-wrap-distance-left:0;mso-wrap-distance-right:0;mso-wrap-distance-bottom:.05pt;mso-position-horizontal-relative:page" coordsize="69588,201" o:gfxdata="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" o:allowincell="f">
+              <v:group w14:anchorId="54D97AF5" id="Group 72" o:spid="_x0000_s1026" style="position:absolute;margin-left:36pt;margin-top:8.65pt;width:547.95pt;height:1.6pt;z-index:-503316455;mso-wrap-distance-left:0;mso-wrap-distance-right:0;mso-wrap-distance-bottom:.05pt;mso-position-horizontal-relative:page" coordsize="69588,201" o:gfxdata="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" o:allowincell="f">
                 <v:shape id="Graphic 73" o:spid="_x0000_s1027" style="position:absolute;width:69570;height:198;visibility:visible;mso-wrap-style:square;v-text-anchor:top" coordsize="6957059,19685" o:gfxdata="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" path="m6957060,r-1524,l3048,,,,,3048,,19685r6957060,l6957060,xe" fillcolor="#9f9f9f" stroked="f" strokeweight="0">
                   <v:path arrowok="t" textboxrect="0,0,6957694,20320"/>
                 </v:shape>
@@ -11026,7 +10965,7 @@
           </mc:Choice>
           <mc:Fallback>
             <w:pict>
-              <v:group w14:anchorId="390D9C9F" id="Group 79" o:spid="_x0000_s1026" style="position:absolute;margin-left:36pt;margin-top:9.85pt;width:558.15pt;height:1.65pt;z-index:-503316456;mso-wrap-distance-left:0;mso-wrap-distance-right:0;mso-position-horizontal-relative:page" coordsize="70884,208" o:gfxdata="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" o:allowincell="f">
+              <v:group w14:anchorId="337B5F55" id="Group 79" o:spid="_x0000_s1026" style="position:absolute;margin-left:36pt;margin-top:9.85pt;width:558.15pt;height:1.65pt;z-index:-503316456;mso-wrap-distance-left:0;mso-wrap-distance-right:0;mso-position-horizontal-relative:page" coordsize="70884,208" o:gfxdata="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" o:allowincell="f">
                 <v:shape id="Graphic 80" o:spid="_x0000_s1027" style="position:absolute;width:70866;height:208;visibility:visible;mso-wrap-style:square;v-text-anchor:top" coordsize="7086600,20955" o:gfxdata="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" path="m7086600,l,,,901,,3937,,20332r7086600,l7086600,xe" fillcolor="#9f9f9f" stroked="f" strokeweight="0">
                   <v:path arrowok="t" textboxrect="0,0,7087235,21590"/>
                 </v:shape>
@@ -11180,7 +11119,7 @@
           <w:rFonts w:ascii="Wingdings" w:hAnsi="Wingdings"/>
         </w:rPr>
       </w:pPr>
-      <w:hyperlink r:id="rId15">
+      <w:hyperlink r:id="rId16">
         <w:r>
           <w:rPr>
             <w:noProof/>
@@ -11270,7 +11209,7 @@
             </mc:Choice>
             <mc:Fallback>
               <w:pict>
-                <v:shape w14:anchorId="6435E90F" id="Graphic 86" o:spid="_x0000_s1026" style="position:absolute;margin-left:74.55pt;margin-top:12.1pt;width:122.1pt;height:1.1pt;z-index:-503316473;visibility:visible;mso-wrap-style:square;mso-wrap-distance-left:0;mso-wrap-distance-top:0;mso-wrap-distance-right:0;mso-wrap-distance-bottom:0;mso-position-horizontal:absolute;mso-position-horizontal-relative:page;mso-position-vertical:absolute;mso-position-vertical-relative:text;v-text-anchor:top" coordsize="1550670,13970" o:gfxdata="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" o:allowincell="f" path="m1550161,l,,,13715r1550161,l1550161,xe" fillcolor="black" stroked="f" strokeweight="0">
+                <v:shape w14:anchorId="46185DC9" id="Graphic 86" o:spid="_x0000_s1026" style="position:absolute;margin-left:74.55pt;margin-top:12.1pt;width:122.1pt;height:1.1pt;z-index:-503316473;visibility:visible;mso-wrap-style:square;mso-wrap-distance-left:0;mso-wrap-distance-top:0;mso-wrap-distance-right:0;mso-wrap-distance-bottom:0;mso-position-horizontal:absolute;mso-position-horizontal-relative:page;mso-position-vertical:absolute;mso-position-vertical-relative:text;v-text-anchor:top" coordsize="1550670,13970" o:gfxdata="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" o:allowincell="f" path="m1550161,l,,,13715r1550161,l1550161,xe" fillcolor="black" stroked="f" strokeweight="0">
                   <v:path arrowok="t" textboxrect="0,0,1551305,14605"/>
                   <w10:wrap anchorx="page"/>
                 </v:shape>
@@ -11512,7 +11451,7 @@
           </mc:Choice>
           <mc:Fallback>
             <w:pict>
-              <v:shape w14:anchorId="0A536E6A" id="Graphic 87" o:spid="_x0000_s1026" style="position:absolute;margin-left:211.7pt;margin-top:12.15pt;width:123.3pt;height:1.1pt;z-index:-503316470;visibility:visible;mso-wrap-style:square;mso-wrap-distance-left:0;mso-wrap-distance-top:0;mso-wrap-distance-right:0;mso-wrap-distance-bottom:0;mso-position-horizontal:absolute;mso-position-horizontal-relative:page;mso-position-vertical:absolute;mso-position-vertical-relative:text;v-text-anchor:top" coordsize="1565910,13970" o:gfxdata="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" o:allowincell="f" path="m1565402,l,,,13715r1565402,l1565402,xe" fillcolor="black" stroked="f" strokeweight="0">
+              <v:shape w14:anchorId="6099653D" id="Graphic 87" o:spid="_x0000_s1026" style="position:absolute;margin-left:211.7pt;margin-top:12.15pt;width:123.3pt;height:1.1pt;z-index:-503316470;visibility:visible;mso-wrap-style:square;mso-wrap-distance-left:0;mso-wrap-distance-top:0;mso-wrap-distance-right:0;mso-wrap-distance-bottom:0;mso-position-horizontal:absolute;mso-position-horizontal-relative:page;mso-position-vertical:absolute;mso-position-vertical-relative:text;v-text-anchor:top" coordsize="1565910,13970" o:gfxdata="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" o:allowincell="f" path="m1565402,l,,,13715r1565402,l1565402,xe" fillcolor="black" stroked="f" strokeweight="0">
                 <v:path arrowok="t" textboxrect="0,0,1566545,14605"/>
                 <w10:wrap anchorx="page"/>
               </v:shape>
@@ -11523,7 +11462,7 @@
       <w:r>
         <w:t xml:space="preserve">Saranya Shanmugasundaram, </w:t>
       </w:r>
-      <w:hyperlink r:id="rId16">
+      <w:hyperlink r:id="rId17">
         <w:proofErr w:type="spellStart"/>
         <w:r>
           <w:rPr>
@@ -11736,7 +11675,7 @@
           <w:rFonts w:ascii="Wingdings" w:hAnsi="Wingdings"/>
         </w:rPr>
       </w:pPr>
-      <w:hyperlink r:id="rId17">
+      <w:hyperlink r:id="rId18">
         <w:r>
           <w:rPr>
             <w:noProof/>
@@ -11826,7 +11765,7 @@
             </mc:Choice>
             <mc:Fallback>
               <w:pict>
-                <v:shape w14:anchorId="07EA829F" id="Graphic 88" o:spid="_x0000_s1026" style="position:absolute;margin-left:74.55pt;margin-top:16.05pt;width:124.5pt;height:1.1pt;z-index:23;visibility:visible;mso-wrap-style:square;mso-wrap-distance-left:0;mso-wrap-distance-top:0;mso-wrap-distance-right:0;mso-wrap-distance-bottom:0;mso-position-horizontal:absolute;mso-position-horizontal-relative:page;mso-position-vertical:absolute;mso-position-vertical-relative:text;v-text-anchor:top" coordsize="1581150,13970" o:gfxdata="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" o:allowincell="f" path="m1580642,l,,,13715r1580642,l1580642,xe" fillcolor="black" stroked="f" strokeweight="0">
+                <v:shape w14:anchorId="00115C79" id="Graphic 88" o:spid="_x0000_s1026" style="position:absolute;margin-left:74.55pt;margin-top:16.05pt;width:124.5pt;height:1.1pt;z-index:23;visibility:visible;mso-wrap-style:square;mso-wrap-distance-left:0;mso-wrap-distance-top:0;mso-wrap-distance-right:0;mso-wrap-distance-bottom:0;mso-position-horizontal:absolute;mso-position-horizontal-relative:page;mso-position-vertical:absolute;mso-position-vertical-relative:text;v-text-anchor:top" coordsize="1581150,13970" o:gfxdata="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" o:allowincell="f" path="m1580642,l,,,13715r1580642,l1580642,xe" fillcolor="black" stroked="f" strokeweight="0">
                   <v:path arrowok="t" textboxrect="0,0,1581785,14605"/>
                   <w10:wrap anchorx="page"/>
                 </v:shape>
@@ -12026,7 +11965,7 @@
           </mc:Choice>
           <mc:Fallback>
             <w:pict>
-              <v:shape w14:anchorId="362291ED" id="Graphic 89" o:spid="_x0000_s1026" style="position:absolute;margin-left:236.7pt;margin-top:15.2pt;width:129.4pt;height:1.1pt;z-index:22;visibility:visible;mso-wrap-style:square;mso-wrap-distance-left:0;mso-wrap-distance-top:0;mso-wrap-distance-right:0;mso-wrap-distance-bottom:0;mso-position-horizontal:absolute;mso-position-horizontal-relative:page;mso-position-vertical:absolute;mso-position-vertical-relative:text;v-text-anchor:top" coordsize="1643380,13970" o:gfxdata="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" o:allowincell="f" path="m1643126,l,,,13715r1643126,l1643126,xe" fillcolor="black" stroked="f" strokeweight="0">
+              <v:shape w14:anchorId="1F3FB948" id="Graphic 89" o:spid="_x0000_s1026" style="position:absolute;margin-left:236.7pt;margin-top:15.2pt;width:129.4pt;height:1.1pt;z-index:22;visibility:visible;mso-wrap-style:square;mso-wrap-distance-left:0;mso-wrap-distance-top:0;mso-wrap-distance-right:0;mso-wrap-distance-bottom:0;mso-position-horizontal:absolute;mso-position-horizontal-relative:page;mso-position-vertical:absolute;mso-position-vertical-relative:text;v-text-anchor:top" coordsize="1643380,13970" o:gfxdata="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" o:allowincell="f" path="m1643126,l,,,13715r1643126,l1643126,xe" fillcolor="black" stroked="f" strokeweight="0">
                 <v:path arrowok="t" textboxrect="0,0,1644015,14605"/>
                 <w10:wrap anchorx="page"/>
               </v:shape>
@@ -12055,7 +11994,7 @@
       <w:r>
         <w:t xml:space="preserve">, </w:t>
       </w:r>
-      <w:hyperlink r:id="rId18">
+      <w:hyperlink r:id="rId19">
         <w:r>
           <w:rPr>
             <w:b/>
@@ -12281,7 +12220,7 @@
           <w:rFonts w:ascii="Wingdings" w:hAnsi="Wingdings"/>
         </w:rPr>
       </w:pPr>
-      <w:hyperlink r:id="rId19">
+      <w:hyperlink r:id="rId20">
         <w:proofErr w:type="spellStart"/>
         <w:r>
           <w:rPr>
@@ -12541,7 +12480,7 @@
           <w:rFonts w:ascii="Wingdings" w:hAnsi="Wingdings"/>
         </w:rPr>
       </w:pPr>
-      <w:hyperlink r:id="rId20">
+      <w:hyperlink r:id="rId21">
         <w:proofErr w:type="spellStart"/>
         <w:r>
           <w:rPr>
@@ -12659,221 +12598,6 @@
           <w:rFonts w:ascii="Wingdings" w:hAnsi="Wingdings"/>
         </w:rPr>
       </w:pPr>
-      <w:hyperlink r:id="rId21">
-        <w:r>
-          <w:rPr>
-            <w:b/>
-            <w:u w:val="single"/>
-          </w:rPr>
-          <w:t xml:space="preserve">Ashok Kumar </w:t>
-        </w:r>
-        <w:proofErr w:type="spellStart"/>
-        <w:r>
-          <w:rPr>
-            <w:b/>
-            <w:u w:val="single"/>
-          </w:rPr>
-          <w:t>Kumaravel</w:t>
-        </w:r>
-        <w:proofErr w:type="spellEnd"/>
-      </w:hyperlink>
-      <w:r>
-        <w:rPr>
-          <w:b/>
-          <w:position w:val="8"/>
-        </w:rPr>
-        <w:t>1</w:t>
-      </w:r>
-      <w:r>
-        <w:t>, Vidhya Selvamani</w:t>
-      </w:r>
-      <w:r>
-        <w:rPr>
-          <w:vertAlign w:val="superscript"/>
-        </w:rPr>
-        <w:t>1</w:t>
-      </w:r>
-      <w:r>
-        <w:t xml:space="preserve">, SH Hong*, “Photocatalytic reduction of methylene blue by the </w:t>
-      </w:r>
-      <w:r>
-        <w:rPr>
-          <w:spacing w:val="-2"/>
-        </w:rPr>
-        <w:t>cobalt-bound</w:t>
-      </w:r>
-      <w:r>
-        <w:rPr>
-          <w:spacing w:val="-12"/>
-        </w:rPr>
-        <w:t xml:space="preserve"> </w:t>
-      </w:r>
-      <w:r>
-        <w:rPr>
-          <w:spacing w:val="-2"/>
-        </w:rPr>
-        <w:t>surface-engineered</w:t>
-      </w:r>
-      <w:r>
-        <w:rPr>
-          <w:spacing w:val="-12"/>
-        </w:rPr>
-        <w:t xml:space="preserve"> </w:t>
-      </w:r>
-      <w:r>
-        <w:rPr>
-          <w:spacing w:val="-2"/>
-        </w:rPr>
-        <w:t>recombinant</w:t>
-      </w:r>
-      <w:r>
-        <w:rPr>
-          <w:spacing w:val="-8"/>
-        </w:rPr>
-        <w:t xml:space="preserve"> </w:t>
-      </w:r>
-      <w:r>
-        <w:rPr>
-          <w:i/>
-          <w:spacing w:val="-2"/>
-        </w:rPr>
-        <w:t>Escherichia</w:t>
-      </w:r>
-      <w:r>
-        <w:rPr>
-          <w:i/>
-          <w:spacing w:val="-9"/>
-        </w:rPr>
-        <w:t xml:space="preserve"> </w:t>
-      </w:r>
-      <w:r>
-        <w:rPr>
-          <w:i/>
-          <w:spacing w:val="-2"/>
-        </w:rPr>
-        <w:t>coli</w:t>
-      </w:r>
-      <w:r>
-        <w:rPr>
-          <w:i/>
-          <w:spacing w:val="-7"/>
-        </w:rPr>
-        <w:t xml:space="preserve"> </w:t>
-      </w:r>
-      <w:r>
-        <w:rPr>
-          <w:spacing w:val="-2"/>
-        </w:rPr>
-        <w:t>as</w:t>
-      </w:r>
-      <w:r>
-        <w:rPr>
-          <w:spacing w:val="-7"/>
-        </w:rPr>
-        <w:t xml:space="preserve"> </w:t>
-      </w:r>
-      <w:r>
-        <w:rPr>
-          <w:spacing w:val="-2"/>
-        </w:rPr>
-        <w:t>whole-cell</w:t>
-      </w:r>
-      <w:r>
-        <w:rPr>
-          <w:spacing w:val="-9"/>
-        </w:rPr>
-        <w:t xml:space="preserve"> </w:t>
-      </w:r>
-      <w:r>
-        <w:rPr>
-          <w:spacing w:val="-2"/>
-        </w:rPr>
-        <w:t>biocatalyst,”</w:t>
-      </w:r>
-      <w:r>
-        <w:rPr>
-          <w:spacing w:val="-11"/>
-        </w:rPr>
-        <w:t xml:space="preserve"> </w:t>
-      </w:r>
-      <w:r>
-        <w:rPr>
-          <w:rFonts w:ascii="Verdana" w:hAnsi="Verdana"/>
-          <w:b/>
-          <w:color w:val="006EC0"/>
-          <w:spacing w:val="-2"/>
-        </w:rPr>
-        <w:t>Bioengineering,</w:t>
-      </w:r>
-      <w:r>
-        <w:rPr>
-          <w:rFonts w:ascii="Verdana" w:hAnsi="Verdana"/>
-          <w:b/>
-          <w:color w:val="006EC0"/>
-          <w:spacing w:val="-17"/>
-        </w:rPr>
-        <w:t xml:space="preserve"> </w:t>
-      </w:r>
-      <w:r>
-        <w:rPr>
-          <w:spacing w:val="-2"/>
-        </w:rPr>
-        <w:t>(</w:t>
-      </w:r>
-      <w:r>
-        <w:rPr>
-          <w:rFonts w:ascii="Verdana" w:hAnsi="Verdana"/>
-          <w:b/>
-          <w:color w:val="006EC0"/>
-          <w:spacing w:val="-2"/>
-        </w:rPr>
-        <w:t>IF-</w:t>
-      </w:r>
-      <w:r>
-        <w:rPr>
-          <w:rFonts w:ascii="Verdana" w:hAnsi="Verdana"/>
-          <w:b/>
-          <w:color w:val="006EC0"/>
-          <w:spacing w:val="-8"/>
-        </w:rPr>
-        <w:t>3.7)</w:t>
-      </w:r>
-      <w:r>
-        <w:rPr>
-          <w:rFonts w:ascii="Verdana" w:hAnsi="Verdana"/>
-          <w:b/>
-          <w:color w:val="006EC0"/>
-          <w:spacing w:val="-16"/>
-        </w:rPr>
-        <w:t xml:space="preserve"> </w:t>
-      </w:r>
-      <w:r>
-        <w:rPr>
-          <w:rFonts w:ascii="Verdana" w:hAnsi="Verdana"/>
-          <w:b/>
-          <w:color w:val="006EC0"/>
-          <w:spacing w:val="-8"/>
-        </w:rPr>
-        <w:t>(Q2)</w:t>
-      </w:r>
-    </w:p>
-    <w:p>
-      <w:pPr>
-        <w:pStyle w:val="ListParagraph"/>
-        <w:numPr>
-          <w:ilvl w:val="0"/>
-          <w:numId w:val="2"/>
-        </w:numPr>
-        <w:tabs>
-          <w:tab w:val="left" w:pos="769"/>
-          <w:tab w:val="left" w:pos="773"/>
-        </w:tabs>
-        <w:spacing w:line="247" w:lineRule="auto"/>
-        <w:ind w:right="558" w:hanging="361"/>
-        <w:rPr>
-          <w:rFonts w:ascii="Wingdings" w:hAnsi="Wingdings"/>
-        </w:rPr>
-      </w:pPr>
       <w:hyperlink r:id="rId22">
         <w:r>
           <w:rPr>
@@ -12900,6 +12624,221 @@
         <w:t>1</w:t>
       </w:r>
       <w:r>
+        <w:t>, Vidhya Selvamani</w:t>
+      </w:r>
+      <w:r>
+        <w:rPr>
+          <w:vertAlign w:val="superscript"/>
+        </w:rPr>
+        <w:t>1</w:t>
+      </w:r>
+      <w:r>
+        <w:t xml:space="preserve">, SH Hong*, “Photocatalytic reduction of methylene blue by the </w:t>
+      </w:r>
+      <w:r>
+        <w:rPr>
+          <w:spacing w:val="-2"/>
+        </w:rPr>
+        <w:t>cobalt-bound</w:t>
+      </w:r>
+      <w:r>
+        <w:rPr>
+          <w:spacing w:val="-12"/>
+        </w:rPr>
+        <w:t xml:space="preserve"> </w:t>
+      </w:r>
+      <w:r>
+        <w:rPr>
+          <w:spacing w:val="-2"/>
+        </w:rPr>
+        <w:t>surface-engineered</w:t>
+      </w:r>
+      <w:r>
+        <w:rPr>
+          <w:spacing w:val="-12"/>
+        </w:rPr>
+        <w:t xml:space="preserve"> </w:t>
+      </w:r>
+      <w:r>
+        <w:rPr>
+          <w:spacing w:val="-2"/>
+        </w:rPr>
+        <w:t>recombinant</w:t>
+      </w:r>
+      <w:r>
+        <w:rPr>
+          <w:spacing w:val="-8"/>
+        </w:rPr>
+        <w:t xml:space="preserve"> </w:t>
+      </w:r>
+      <w:r>
+        <w:rPr>
+          <w:i/>
+          <w:spacing w:val="-2"/>
+        </w:rPr>
+        <w:t>Escherichia</w:t>
+      </w:r>
+      <w:r>
+        <w:rPr>
+          <w:i/>
+          <w:spacing w:val="-9"/>
+        </w:rPr>
+        <w:t xml:space="preserve"> </w:t>
+      </w:r>
+      <w:r>
+        <w:rPr>
+          <w:i/>
+          <w:spacing w:val="-2"/>
+        </w:rPr>
+        <w:t>coli</w:t>
+      </w:r>
+      <w:r>
+        <w:rPr>
+          <w:i/>
+          <w:spacing w:val="-7"/>
+        </w:rPr>
+        <w:t xml:space="preserve"> </w:t>
+      </w:r>
+      <w:r>
+        <w:rPr>
+          <w:spacing w:val="-2"/>
+        </w:rPr>
+        <w:t>as</w:t>
+      </w:r>
+      <w:r>
+        <w:rPr>
+          <w:spacing w:val="-7"/>
+        </w:rPr>
+        <w:t xml:space="preserve"> </w:t>
+      </w:r>
+      <w:r>
+        <w:rPr>
+          <w:spacing w:val="-2"/>
+        </w:rPr>
+        <w:t>whole-cell</w:t>
+      </w:r>
+      <w:r>
+        <w:rPr>
+          <w:spacing w:val="-9"/>
+        </w:rPr>
+        <w:t xml:space="preserve"> </w:t>
+      </w:r>
+      <w:r>
+        <w:rPr>
+          <w:spacing w:val="-2"/>
+        </w:rPr>
+        <w:t>biocatalyst,”</w:t>
+      </w:r>
+      <w:r>
+        <w:rPr>
+          <w:spacing w:val="-11"/>
+        </w:rPr>
+        <w:t xml:space="preserve"> </w:t>
+      </w:r>
+      <w:r>
+        <w:rPr>
+          <w:rFonts w:ascii="Verdana" w:hAnsi="Verdana"/>
+          <w:b/>
+          <w:color w:val="006EC0"/>
+          <w:spacing w:val="-2"/>
+        </w:rPr>
+        <w:t>Bioengineering,</w:t>
+      </w:r>
+      <w:r>
+        <w:rPr>
+          <w:rFonts w:ascii="Verdana" w:hAnsi="Verdana"/>
+          <w:b/>
+          <w:color w:val="006EC0"/>
+          <w:spacing w:val="-17"/>
+        </w:rPr>
+        <w:t xml:space="preserve"> </w:t>
+      </w:r>
+      <w:r>
+        <w:rPr>
+          <w:spacing w:val="-2"/>
+        </w:rPr>
+        <w:t>(</w:t>
+      </w:r>
+      <w:r>
+        <w:rPr>
+          <w:rFonts w:ascii="Verdana" w:hAnsi="Verdana"/>
+          <w:b/>
+          <w:color w:val="006EC0"/>
+          <w:spacing w:val="-2"/>
+        </w:rPr>
+        <w:t>IF-</w:t>
+      </w:r>
+      <w:r>
+        <w:rPr>
+          <w:rFonts w:ascii="Verdana" w:hAnsi="Verdana"/>
+          <w:b/>
+          <w:color w:val="006EC0"/>
+          <w:spacing w:val="-8"/>
+        </w:rPr>
+        <w:t>3.7)</w:t>
+      </w:r>
+      <w:r>
+        <w:rPr>
+          <w:rFonts w:ascii="Verdana" w:hAnsi="Verdana"/>
+          <w:b/>
+          <w:color w:val="006EC0"/>
+          <w:spacing w:val="-16"/>
+        </w:rPr>
+        <w:t xml:space="preserve"> </w:t>
+      </w:r>
+      <w:r>
+        <w:rPr>
+          <w:rFonts w:ascii="Verdana" w:hAnsi="Verdana"/>
+          <w:b/>
+          <w:color w:val="006EC0"/>
+          <w:spacing w:val="-8"/>
+        </w:rPr>
+        <w:t>(Q2)</w:t>
+      </w:r>
+    </w:p>
+    <w:p>
+      <w:pPr>
+        <w:pStyle w:val="ListParagraph"/>
+        <w:numPr>
+          <w:ilvl w:val="0"/>
+          <w:numId w:val="2"/>
+        </w:numPr>
+        <w:tabs>
+          <w:tab w:val="left" w:pos="769"/>
+          <w:tab w:val="left" w:pos="773"/>
+        </w:tabs>
+        <w:spacing w:line="247" w:lineRule="auto"/>
+        <w:ind w:right="558" w:hanging="361"/>
+        <w:rPr>
+          <w:rFonts w:ascii="Wingdings" w:hAnsi="Wingdings"/>
+        </w:rPr>
+      </w:pPr>
+      <w:hyperlink r:id="rId23">
+        <w:r>
+          <w:rPr>
+            <w:b/>
+            <w:u w:val="single"/>
+          </w:rPr>
+          <w:t xml:space="preserve">Ashok Kumar </w:t>
+        </w:r>
+        <w:proofErr w:type="spellStart"/>
+        <w:r>
+          <w:rPr>
+            <w:b/>
+            <w:u w:val="single"/>
+          </w:rPr>
+          <w:t>Kumaravel</w:t>
+        </w:r>
+        <w:proofErr w:type="spellEnd"/>
+      </w:hyperlink>
+      <w:r>
+        <w:rPr>
+          <w:b/>
+          <w:position w:val="8"/>
+        </w:rPr>
+        <w:t>1</w:t>
+      </w:r>
+      <w:r>
         <w:t>, KNT Tran</w:t>
       </w:r>
       <w:r>
@@ -12911,7 +12850,7 @@
       <w:r>
         <w:t>, SH Hong*, “</w:t>
       </w:r>
-      <w:hyperlink r:id="rId23">
+      <w:hyperlink r:id="rId24">
         <w:r>
           <w:t>Impact of the Synthetic Scaffold Strategy on the</w:t>
         </w:r>
@@ -12919,7 +12858,7 @@
       <w:r>
         <w:t xml:space="preserve"> </w:t>
       </w:r>
-      <w:hyperlink r:id="rId24">
+      <w:hyperlink r:id="rId25">
         <w:r>
           <w:t>Metabolic</w:t>
         </w:r>
@@ -12927,7 +12866,7 @@
       <w:r>
         <w:t xml:space="preserve"> </w:t>
       </w:r>
-      <w:hyperlink r:id="rId25">
+      <w:hyperlink r:id="rId26">
         <w:r>
           <w:rPr>
             <w:spacing w:val="-2"/>
@@ -13060,7 +12999,7 @@
       <w:r>
         <w:t xml:space="preserve">, </w:t>
       </w:r>
-      <w:hyperlink r:id="rId26">
+      <w:hyperlink r:id="rId27">
         <w:r>
           <w:rPr>
             <w:b/>
@@ -13097,7 +13036,7 @@
       <w:r>
         <w:t>, SH Hong*, “</w:t>
       </w:r>
-      <w:hyperlink r:id="rId27">
+      <w:hyperlink r:id="rId28">
         <w:r>
           <w:t>High Yield Fermentation of L-serine in</w:t>
         </w:r>
@@ -13105,7 +13044,7 @@
       <w:r>
         <w:t xml:space="preserve"> </w:t>
       </w:r>
-      <w:hyperlink r:id="rId28">
+      <w:hyperlink r:id="rId29">
         <w:r>
           <w:t>Recombinant</w:t>
         </w:r>
@@ -13370,7 +13309,7 @@
           </mc:Choice>
           <mc:Fallback>
             <w:pict>
-              <v:shape w14:anchorId="61DA4438" id="Graphic 90" o:spid="_x0000_s1026" style="position:absolute;margin-left:468.8pt;margin-top:27.35pt;width:3.75pt;height:.75pt;z-index:-503316472;visibility:visible;mso-wrap-style:square;mso-wrap-distance-left:0;mso-wrap-distance-top:0;mso-wrap-distance-right:0;mso-wrap-distance-bottom:0;mso-position-horizontal:absolute;mso-position-horizontal-relative:page;mso-position-vertical:absolute;mso-position-vertical-relative:text;v-text-anchor:top" coordsize="47625,9525" o:gfxdata="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" o:allowincell="f" path="m47244,l,,,9144r47244,l47244,xe" fillcolor="black" stroked="f" strokeweight="0">
+              <v:shape w14:anchorId="0BC4E235" id="Graphic 90" o:spid="_x0000_s1026" style="position:absolute;margin-left:468.8pt;margin-top:27.35pt;width:3.75pt;height:.75pt;z-index:-503316472;visibility:visible;mso-wrap-style:square;mso-wrap-distance-left:0;mso-wrap-distance-top:0;mso-wrap-distance-right:0;mso-wrap-distance-bottom:0;mso-position-horizontal:absolute;mso-position-horizontal-relative:page;mso-position-vertical:absolute;mso-position-vertical-relative:text;v-text-anchor:top" coordsize="47625,9525" o:gfxdata="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" o:allowincell="f" path="m47244,l,,,9144r47244,l47244,xe" fillcolor="black" stroked="f" strokeweight="0">
                 <v:path arrowok="t" textboxrect="0,0,48260,10160"/>
                 <w10:wrap anchorx="page"/>
               </v:shape>
@@ -13533,7 +13472,7 @@
       <w:r>
         <w:t xml:space="preserve">, </w:t>
       </w:r>
-      <w:hyperlink r:id="rId29">
+      <w:hyperlink r:id="rId30">
         <w:r>
           <w:rPr>
             <w:b/>
@@ -13561,7 +13500,7 @@
       <w:r>
         <w:t>et.al, “</w:t>
       </w:r>
-      <w:hyperlink r:id="rId30">
+      <w:hyperlink r:id="rId31">
         <w:r>
           <w:t>Biomedical and</w:t>
         </w:r>
@@ -13569,7 +13508,7 @@
       <w:r>
         <w:t xml:space="preserve"> </w:t>
       </w:r>
-      <w:hyperlink r:id="rId31">
+      <w:hyperlink r:id="rId32">
         <w:r>
           <w:t>Textile Applications of</w:t>
         </w:r>
@@ -13577,7 +13516,7 @@
       <w:r>
         <w:t xml:space="preserve"> </w:t>
       </w:r>
-      <w:hyperlink r:id="rId32">
+      <w:hyperlink r:id="rId33">
         <w:r>
           <w:rPr>
             <w:i/>
@@ -13614,7 +13553,7 @@
         </w:rPr>
         <w:t xml:space="preserve"> </w:t>
       </w:r>
-      <w:hyperlink r:id="rId33">
+      <w:hyperlink r:id="rId34">
         <w:r>
           <w:rPr>
             <w:spacing w:val="-2"/>
@@ -13772,7 +13711,7 @@
       <w:r>
         <w:t xml:space="preserve">, </w:t>
       </w:r>
-      <w:hyperlink r:id="rId34">
+      <w:hyperlink r:id="rId35">
         <w:r>
           <w:rPr>
             <w:b/>
@@ -13800,7 +13739,7 @@
       <w:r>
         <w:t>, “</w:t>
       </w:r>
-      <w:hyperlink r:id="rId35">
+      <w:hyperlink r:id="rId36">
         <w:r>
           <w:t>Analysis of the hybrid of mudar/snake grass fiber-</w:t>
         </w:r>
@@ -13808,7 +13747,7 @@
       <w:r>
         <w:t xml:space="preserve"> </w:t>
       </w:r>
-      <w:hyperlink r:id="rId36">
+      <w:hyperlink r:id="rId37">
         <w:r>
           <w:t>reinforced epoxy with</w:t>
         </w:r>
@@ -13816,7 +13755,7 @@
       <w:r>
         <w:t xml:space="preserve"> </w:t>
       </w:r>
-      <w:hyperlink r:id="rId37">
+      <w:hyperlink r:id="rId38">
         <w:r>
           <w:rPr>
             <w:w w:val="90"/>
@@ -14056,7 +13995,7 @@
         </w:rPr>
         <w:t xml:space="preserve"> </w:t>
       </w:r>
-      <w:hyperlink r:id="rId38">
+      <w:hyperlink r:id="rId39">
         <w:r>
           <w:rPr>
             <w:b/>
@@ -14134,7 +14073,7 @@
       <w:r>
         <w:t>“</w:t>
       </w:r>
-      <w:hyperlink r:id="rId39">
+      <w:hyperlink r:id="rId40">
         <w:r>
           <w:t>Whole-cell</w:t>
         </w:r>
@@ -14178,7 +14117,7 @@
         </w:rPr>
         <w:t xml:space="preserve"> </w:t>
       </w:r>
-      <w:hyperlink r:id="rId40">
+      <w:hyperlink r:id="rId41">
         <w:proofErr w:type="spellStart"/>
         <w:r>
           <w:rPr>
@@ -14194,7 +14133,7 @@
         </w:rPr>
         <w:t xml:space="preserve"> </w:t>
       </w:r>
-      <w:hyperlink r:id="rId41">
+      <w:hyperlink r:id="rId42">
         <w:r>
           <w:t xml:space="preserve">glutamate decarboxylase in </w:t>
         </w:r>
@@ -14211,7 +14150,7 @@
       <w:r>
         <w:t xml:space="preserve"> </w:t>
       </w:r>
-      <w:hyperlink r:id="rId42">
+      <w:hyperlink r:id="rId43">
         <w:r>
           <w:t>acid production,</w:t>
         </w:r>
@@ -14818,7 +14757,7 @@
           </mc:Choice>
           <mc:Fallback>
             <w:pict>
-              <v:group w14:anchorId="6E32C0D9" id="Group 91" o:spid="_x0000_s1026" style="position:absolute;margin-left:36pt;margin-top:10.35pt;width:558.15pt;height:1.6pt;z-index:-503316462;mso-wrap-distance-left:0;mso-wrap-distance-right:0;mso-wrap-distance-bottom:.05pt;mso-position-horizontal-relative:page" coordsize="70884,201" o:gfxdata="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" o:allowincell="f">
+              <v:group w14:anchorId="66C2C120" id="Group 91" o:spid="_x0000_s1026" style="position:absolute;margin-left:36pt;margin-top:10.35pt;width:558.15pt;height:1.6pt;z-index:-503316462;mso-wrap-distance-left:0;mso-wrap-distance-right:0;mso-wrap-distance-bottom:.05pt;mso-position-horizontal-relative:page" coordsize="70884,201" o:gfxdata="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" o:allowincell="f">
                 <v:shape id="Graphic 92" o:spid="_x0000_s1027" style="position:absolute;width:70866;height:198;visibility:visible;mso-wrap-style:square;v-text-anchor:top" coordsize="7086600,19685" o:gfxdata="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" path="m7086600,l,,,139,,3175,,19685r7086600,l7086600,xe" fillcolor="#9f9f9f" stroked="f" strokeweight="0">
                   <v:path arrowok="t" textboxrect="0,0,7087235,20320"/>
                 </v:shape>
@@ -14979,7 +14918,7 @@
           </mc:Choice>
           <mc:Fallback>
             <w:pict>
-              <v:shape w14:anchorId="4BF559D2" id="Graphic 98" o:spid="_x0000_s1026" style="position:absolute;margin-left:158.75pt;margin-top:12.15pt;width:124.5pt;height:1.1pt;z-index:-503316471;visibility:visible;mso-wrap-style:square;mso-wrap-distance-left:0;mso-wrap-distance-top:0;mso-wrap-distance-right:0;mso-wrap-distance-bottom:0;mso-position-horizontal:absolute;mso-position-horizontal-relative:page;mso-position-vertical:absolute;mso-position-vertical-relative:text;v-text-anchor:top" coordsize="1581150,13970" o:gfxdata="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" o:allowincell="f" path="m1580642,l,,,13716r1580642,l1580642,xe" fillcolor="#212121" stroked="f" strokeweight="0">
+              <v:shape w14:anchorId="382FF4A8" id="Graphic 98" o:spid="_x0000_s1026" style="position:absolute;margin-left:158.75pt;margin-top:12.15pt;width:124.5pt;height:1.1pt;z-index:-503316471;visibility:visible;mso-wrap-style:square;mso-wrap-distance-left:0;mso-wrap-distance-top:0;mso-wrap-distance-right:0;mso-wrap-distance-bottom:0;mso-position-horizontal:absolute;mso-position-horizontal-relative:page;mso-position-vertical:absolute;mso-position-vertical-relative:text;v-text-anchor:top" coordsize="1581150,13970" o:gfxdata="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" o:allowincell="f" path="m1580642,l,,,13716r1580642,l1580642,xe" fillcolor="#212121" stroked="f" strokeweight="0">
                 <v:path arrowok="t" textboxrect="0,0,1581785,14605"/>
                 <w10:wrap anchorx="page"/>
               </v:shape>
@@ -15276,7 +15215,7 @@
           <w:rFonts w:ascii="Wingdings" w:hAnsi="Wingdings"/>
         </w:rPr>
       </w:pPr>
-      <w:hyperlink r:id="rId43">
+      <w:hyperlink r:id="rId44">
         <w:proofErr w:type="spellStart"/>
         <w:r>
           <w:rPr>
@@ -15563,7 +15502,7 @@
           <w:rFonts w:ascii="Wingdings" w:hAnsi="Wingdings"/>
         </w:rPr>
       </w:pPr>
-      <w:hyperlink r:id="rId44">
+      <w:hyperlink r:id="rId45">
         <w:proofErr w:type="spellStart"/>
         <w:r>
           <w:rPr>
@@ -15802,7 +15741,7 @@
           <w:rFonts w:ascii="Wingdings" w:hAnsi="Wingdings"/>
         </w:rPr>
       </w:pPr>
-      <w:hyperlink r:id="rId45">
+      <w:hyperlink r:id="rId46">
         <w:proofErr w:type="spellStart"/>
         <w:r>
           <w:rPr>
@@ -16533,7 +16472,7 @@
           </mc:Choice>
           <mc:Fallback>
             <w:pict>
-              <v:group w14:anchorId="6D89042C" id="Group 99" o:spid="_x0000_s1026" style="position:absolute;margin-left:36pt;margin-top:8.35pt;width:547.8pt;height:1.65pt;z-index:-503316461;mso-wrap-distance-left:0;mso-wrap-distance-right:0;mso-position-horizontal-relative:page" coordsize="69570,208" o:gfxdata="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" o:allowincell="f">
+              <v:group w14:anchorId="61579B57" id="Group 99" o:spid="_x0000_s1026" style="position:absolute;margin-left:36pt;margin-top:8.35pt;width:547.8pt;height:1.65pt;z-index:-503316461;mso-wrap-distance-left:0;mso-wrap-distance-right:0;mso-position-horizontal-relative:page" coordsize="69570,208" o:gfxdata="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" o:allowincell="f">
                 <v:shape id="Graphic 100" o:spid="_x0000_s1027" style="position:absolute;width:69559;height:198;visibility:visible;mso-wrap-style:square;v-text-anchor:top" coordsize="6955790,19685" o:gfxdata="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" path="m6955790,l,,,635,,3683,,19685r6955790,l6955790,xe" fillcolor="#9f9f9f" stroked="f" strokeweight="0">
                   <v:path arrowok="t" textboxrect="0,0,6956425,20320"/>
                 </v:shape>
@@ -17743,7 +17682,7 @@
           </mc:Choice>
           <mc:Fallback>
             <w:pict>
-              <v:shape w14:anchorId="6D979EA6" id="Graphic 106" o:spid="_x0000_s1026" style="position:absolute;margin-left:185.3pt;margin-top:11.7pt;width:112.5pt;height:1.1pt;z-index:20;visibility:visible;mso-wrap-style:square;mso-wrap-distance-left:0;mso-wrap-distance-top:0;mso-wrap-distance-right:0;mso-wrap-distance-bottom:0;mso-position-horizontal:absolute;mso-position-horizontal-relative:page;mso-position-vertical:absolute;mso-position-vertical-relative:text;v-text-anchor:top" coordsize="1428750,13970" o:gfxdata="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" o:allowincell="f" path="m1428241,l,,,13716r1428241,l1428241,xe" fillcolor="black" stroked="f" strokeweight="0">
+              <v:shape w14:anchorId="6C8DF67D" id="Graphic 106" o:spid="_x0000_s1026" style="position:absolute;margin-left:185.3pt;margin-top:11.7pt;width:112.5pt;height:1.1pt;z-index:20;visibility:visible;mso-wrap-style:square;mso-wrap-distance-left:0;mso-wrap-distance-top:0;mso-wrap-distance-right:0;mso-wrap-distance-bottom:0;mso-position-horizontal:absolute;mso-position-horizontal-relative:page;mso-position-vertical:absolute;mso-position-vertical-relative:text;v-text-anchor:top" coordsize="1428750,13970" o:gfxdata="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" o:allowincell="f" path="m1428241,l,,,13716r1428241,l1428241,xe" fillcolor="black" stroked="f" strokeweight="0">
                 <v:path arrowok="t" textboxrect="0,0,1429385,14605"/>
                 <w10:wrap anchorx="page"/>
               </v:shape>
@@ -18743,7 +18682,7 @@
           </mc:Choice>
           <mc:Fallback>
             <w:pict>
-              <v:group w14:anchorId="5CDABD2D" id="Group 107" o:spid="_x0000_s1026" style="position:absolute;margin-left:36pt;margin-top:9.9pt;width:536.9pt;height:1.65pt;z-index:-503316459;mso-wrap-distance-left:0;mso-wrap-distance-right:.05pt;mso-position-horizontal-relative:page" coordsize="68187,208" o:gfxdata="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" o:allowincell="f">
+              <v:group w14:anchorId="2B6B2E4C" id="Group 107" o:spid="_x0000_s1026" style="position:absolute;margin-left:36pt;margin-top:9.9pt;width:536.9pt;height:1.65pt;z-index:-503316459;mso-wrap-distance-left:0;mso-wrap-distance-right:.05pt;mso-position-horizontal-relative:page" coordsize="68187,208" o:gfxdata="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" o:allowincell="f">
                 <v:shape id="Graphic 108" o:spid="_x0000_s1027" style="position:absolute;width:68166;height:198;visibility:visible;mso-wrap-style:square;v-text-anchor:top" coordsize="6816725,19685" o:gfxdata="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" path="m6816725,l,,,1155,,4191,,19685r6816725,l6816725,xe" fillcolor="#9f9f9f" stroked="f" strokeweight="0">
                   <v:path arrowok="t" textboxrect="0,0,6817360,20320"/>
                 </v:shape>
@@ -19211,7 +19150,7 @@
       <w:r>
         <w:t>“</w:t>
       </w:r>
-      <w:hyperlink r:id="rId46">
+      <w:hyperlink r:id="rId47">
         <w:r>
           <w:rPr>
             <w:i/>
@@ -19306,7 +19245,7 @@
         </w:rPr>
         <w:t xml:space="preserve"> </w:t>
       </w:r>
-      <w:hyperlink r:id="rId47">
+      <w:hyperlink r:id="rId48">
         <w:r>
           <w:rPr>
             <w:i/>
@@ -19346,7 +19285,7 @@
         </w:rPr>
         <w:t xml:space="preserve"> </w:t>
       </w:r>
-      <w:hyperlink r:id="rId48">
+      <w:hyperlink r:id="rId49">
         <w:r>
           <w:rPr>
             <w:i/>
@@ -19437,7 +19376,7 @@
       <w:r>
         <w:t>SH Hong, “</w:t>
       </w:r>
-      <w:hyperlink r:id="rId49">
+      <w:hyperlink r:id="rId50">
         <w:r>
           <w:t xml:space="preserve">Displaying </w:t>
         </w:r>
@@ -19468,7 +19407,7 @@
       <w:r>
         <w:t xml:space="preserve"> </w:t>
       </w:r>
-      <w:hyperlink r:id="rId50">
+      <w:hyperlink r:id="rId51">
         <w:r>
           <w:t>on the</w:t>
         </w:r>
@@ -19476,7 +19415,7 @@
       <w:r>
         <w:t xml:space="preserve"> </w:t>
       </w:r>
-      <w:hyperlink r:id="rId51">
+      <w:hyperlink r:id="rId52">
         <w:r>
           <w:t xml:space="preserve">Surface of </w:t>
         </w:r>
@@ -19493,7 +19432,7 @@
       <w:r>
         <w:t xml:space="preserve"> </w:t>
       </w:r>
-      <w:hyperlink r:id="rId52">
+      <w:hyperlink r:id="rId53">
         <w:r>
           <w:t>Cell Density</w:t>
         </w:r>
@@ -19501,7 +19440,7 @@
       <w:r>
         <w:t xml:space="preserve"> </w:t>
       </w:r>
-      <w:hyperlink r:id="rId53">
+      <w:hyperlink r:id="rId54">
         <w:r>
           <w:rPr>
             <w:w w:val="85"/>
@@ -19900,7 +19839,7 @@
       <w:r>
         <w:t xml:space="preserve"> Jeong, SH Hong, “</w:t>
       </w:r>
-      <w:hyperlink r:id="rId54">
+      <w:hyperlink r:id="rId55">
         <w:r>
           <w:t xml:space="preserve">Cell Surface Display of </w:t>
         </w:r>
@@ -19939,7 +19878,7 @@
       <w:r>
         <w:t xml:space="preserve"> </w:t>
       </w:r>
-      <w:hyperlink r:id="rId55">
+      <w:hyperlink r:id="rId56">
         <w:r>
           <w:t xml:space="preserve">Decarboxylase in </w:t>
         </w:r>
@@ -20035,7 +19974,7 @@
       <w:r>
         <w:t>SH Hong, “</w:t>
       </w:r>
-      <w:hyperlink r:id="rId56">
+      <w:hyperlink r:id="rId57">
         <w:r>
           <w:t xml:space="preserve">Construction of Pesticides Recovering </w:t>
         </w:r>
@@ -20052,7 +19991,7 @@
         </w:rPr>
         <w:t xml:space="preserve"> </w:t>
       </w:r>
-      <w:hyperlink r:id="rId57">
+      <w:hyperlink r:id="rId58">
         <w:r>
           <w:t>through</w:t>
         </w:r>
@@ -20060,7 +19999,7 @@
       <w:r>
         <w:t xml:space="preserve"> </w:t>
       </w:r>
-      <w:hyperlink r:id="rId58">
+      <w:hyperlink r:id="rId59">
         <w:r>
           <w:rPr>
             <w:spacing w:val="-4"/>
@@ -20290,7 +20229,7 @@
       <w:r>
         <w:t xml:space="preserve"> Jeong, SH Hong, “</w:t>
       </w:r>
-      <w:hyperlink r:id="rId59">
+      <w:hyperlink r:id="rId60">
         <w:r>
           <w:t xml:space="preserve">Enhanced Production of L-serine in </w:t>
         </w:r>
@@ -20307,7 +20246,7 @@
         </w:rPr>
         <w:t xml:space="preserve"> </w:t>
       </w:r>
-      <w:hyperlink r:id="rId60">
+      <w:hyperlink r:id="rId61">
         <w:r>
           <w:t>Through</w:t>
         </w:r>
@@ -20315,7 +20254,7 @@
       <w:r>
         <w:t xml:space="preserve"> </w:t>
       </w:r>
-      <w:hyperlink r:id="rId61">
+      <w:hyperlink r:id="rId62">
         <w:r>
           <w:rPr>
             <w:w w:val="90"/>
@@ -20627,7 +20566,7 @@
       <w:r>
         <w:t xml:space="preserve"> Hong. “</w:t>
       </w:r>
-      <w:hyperlink r:id="rId62">
+      <w:hyperlink r:id="rId63">
         <w:r>
           <w:t>Improved Itaconic Acid Production by</w:t>
         </w:r>
@@ -20635,7 +20574,7 @@
       <w:r>
         <w:t xml:space="preserve"> </w:t>
       </w:r>
-      <w:hyperlink r:id="rId63">
+      <w:hyperlink r:id="rId64">
         <w:r>
           <w:t>Employing</w:t>
         </w:r>
@@ -20643,7 +20582,7 @@
       <w:r>
         <w:t xml:space="preserve"> </w:t>
       </w:r>
-      <w:hyperlink r:id="rId64">
+      <w:hyperlink r:id="rId65">
         <w:r>
           <w:t xml:space="preserve">Protein Scaffold Between </w:t>
         </w:r>
@@ -20765,7 +20704,7 @@
       <w:r>
         <w:t xml:space="preserve"> Jeong, SH Hong, “</w:t>
       </w:r>
-      <w:hyperlink r:id="rId65">
+      <w:hyperlink r:id="rId66">
         <w:r>
           <w:t>Novel Strategy for Malic Acid Production in</w:t>
         </w:r>
@@ -20773,7 +20712,7 @@
       <w:r>
         <w:t xml:space="preserve"> </w:t>
       </w:r>
-      <w:hyperlink r:id="rId66">
+      <w:hyperlink r:id="rId67">
         <w:r>
           <w:t>Recombinant</w:t>
         </w:r>
@@ -20781,7 +20720,7 @@
       <w:r>
         <w:t xml:space="preserve"> </w:t>
       </w:r>
-      <w:hyperlink r:id="rId67">
+      <w:hyperlink r:id="rId68">
         <w:r>
           <w:rPr>
             <w:i/>
@@ -21015,7 +20954,7 @@
       <w:r>
         <w:t>“</w:t>
       </w:r>
-      <w:hyperlink r:id="rId68">
+      <w:hyperlink r:id="rId69">
         <w:r>
           <w:t>Development</w:t>
         </w:r>
@@ -21062,7 +21001,7 @@
         </w:rPr>
         <w:t xml:space="preserve"> </w:t>
       </w:r>
-      <w:hyperlink r:id="rId69">
+      <w:hyperlink r:id="rId70">
         <w:r>
           <w:rPr>
             <w:i/>
@@ -21076,7 +21015,7 @@
         </w:rPr>
         <w:t xml:space="preserve"> </w:t>
       </w:r>
-      <w:hyperlink r:id="rId70">
+      <w:hyperlink r:id="rId71">
         <w:r>
           <w:rPr>
             <w:i/>
@@ -21641,7 +21580,7 @@
           </mc:Choice>
           <mc:Fallback>
             <w:pict>
-              <v:group w14:anchorId="5518D6C3" id="Group 114" o:spid="_x0000_s1026" style="width:547.95pt;height:1.65pt;mso-position-horizontal-relative:char;mso-position-vertical-relative:line" coordsize="69588,208" o:gfxdata="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">
+              <v:group w14:anchorId="46C65F07" id="Group 114" o:spid="_x0000_s1026" style="width:547.95pt;height:1.65pt;mso-position-horizontal-relative:char;mso-position-vertical-relative:line" coordsize="69588,208" o:gfxdata="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">
                 <v:shape id="Graphic 115" o:spid="_x0000_s1027" style="position:absolute;width:69570;height:198;visibility:visible;mso-wrap-style:square;v-text-anchor:top" coordsize="6957059,19685" o:gfxdata="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" path="m6957060,l,,,1028,,4064,,19685r6957060,l6957060,xe" fillcolor="#9f9f9f" stroked="f" strokeweight="0">
                   <v:path arrowok="t" textboxrect="0,0,6957694,20320"/>
                 </v:shape>
@@ -21670,8 +21609,8 @@
     <w:p>
       <w:pPr>
         <w:sectPr>
-          <w:headerReference w:type="default" r:id="rId71"/>
-          <w:headerReference w:type="first" r:id="rId72"/>
+          <w:headerReference w:type="default" r:id="rId72"/>
+          <w:headerReference w:type="first" r:id="rId73"/>
           <w:pgSz w:w="12240" w:h="15840"/>
           <w:pgMar w:top="940" w:right="0" w:bottom="280" w:left="720" w:header="727" w:footer="0" w:gutter="0"/>
           <w:cols w:space="720"/>
@@ -21698,7 +21637,7 @@
           <w:sz w:val="24"/>
         </w:rPr>
       </w:pPr>
-      <w:hyperlink r:id="rId73"/>
+      <w:hyperlink r:id="rId74"/>
     </w:p>
     <w:p>
       <w:pPr>
@@ -21707,7 +21646,7 @@
           <w:sz w:val="24"/>
         </w:rPr>
       </w:pPr>
-      <w:hyperlink r:id="rId74">
+      <w:hyperlink r:id="rId75">
         <w:r>
           <w:rPr>
             <w:b/>
@@ -21869,7 +21808,7 @@
         </w:rPr>
         <w:t xml:space="preserve">Korea. </w:t>
       </w:r>
-      <w:hyperlink r:id="rId75">
+      <w:hyperlink r:id="rId76">
         <w:r>
           <w:rPr>
             <w:color w:val="0000FF"/>
@@ -22063,7 +22002,7 @@
         </w:rPr>
         <w:t xml:space="preserve">India. </w:t>
       </w:r>
-      <w:hyperlink r:id="rId76">
+      <w:hyperlink r:id="rId77">
         <w:r>
           <w:rPr>
             <w:color w:val="0000FF"/>
@@ -22552,7 +22491,7 @@
           </mc:Choice>
           <mc:Fallback>
             <w:pict>
-              <v:group w14:anchorId="2CC7C0AD" id="Group 121" o:spid="_x0000_s1026" style="width:536.9pt;height:1.65pt;mso-position-horizontal-relative:char;mso-position-vertical-relative:line" coordsize="68187,208" o:gfxdata="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">
+              <v:group w14:anchorId="0E72295B" id="Group 121" o:spid="_x0000_s1026" style="width:536.9pt;height:1.65pt;mso-position-horizontal-relative:char;mso-position-vertical-relative:line" coordsize="68187,208" o:gfxdata="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">
                 <v:shape id="Graphic 122" o:spid="_x0000_s1027" style="position:absolute;width:68166;height:198;visibility:visible;mso-wrap-style:square;v-text-anchor:top" coordsize="6816725,19685" o:gfxdata="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" path="m6816725,l,,,977,,4013,,19685r6816725,l6816725,xe" fillcolor="#9f9f9f" stroked="f" strokeweight="0">
                   <v:path arrowok="t" textboxrect="0,0,6817360,20320"/>
                 </v:shape>
@@ -24469,7 +24408,6 @@
   <w:style w:type="character" w:default="1" w:styleId="DefaultParagraphFont">
     <w:name w:val="Default Paragraph Font"/>
     <w:uiPriority w:val="1"/>
-    <w:semiHidden/>
     <w:unhideWhenUsed/>
   </w:style>
   <w:style w:type="table" w:default="1" w:styleId="TableNormal">
@@ -24595,6 +24533,18 @@
     <w:rPr>
       <w:color w:val="605E5C"/>
       <w:shd w:val="clear" w:color="auto" w:fill="E1DFDD"/>
+    </w:rPr>
+  </w:style>
+  <w:style w:type="character" w:styleId="FollowedHyperlink">
+    <w:name w:val="FollowedHyperlink"/>
+    <w:basedOn w:val="DefaultParagraphFont"/>
+    <w:uiPriority w:val="99"/>
+    <w:semiHidden/>
+    <w:unhideWhenUsed/>
+    <w:rsid w:val="00265DD0"/>
+    <w:rPr>
+      <w:color w:val="800080" w:themeColor="followedHyperlink"/>
+      <w:u w:val="single"/>
     </w:rPr>
   </w:style>
 </w:styles>

</xml_diff>